<commit_message>
Dodano ocene konfiguracji pod katem bezpieczenstwa energetycznego i rekomendacje architektury docelowej
</commit_message>
<xml_diff>
--- a/03_Symulacje_Homer/RAPORT_Symulacje_testowe_HOMER.docx
+++ b/03_Symulacje_Homer/RAPORT_Symulacje_testowe_HOMER.docx
@@ -8408,7 +8408,21 @@
           <w:sz w:val="28"/>
           <w:szCs w:val="28"/>
         </w:rPr>
-        <w:t xml:space="preserve">8. Wnioski metodyczne</w:t>
+        <w:t xml:space="preserve">8. Ocena konfiguracji pod kątem bezpieczeństwa energetycznego</w:t>
+      </w:r>
+    </w:p>
+    <w:p>
+      <w:pPr>
+        <w:spacing w:after="120" w:before="0" w:line="360"/>
+        <w:ind w:firstLine="566"/>
+        <w:jc w:val="both"/>
+      </w:pPr>
+      <w:r>
+        <w:rPr>
+          <w:sz w:val="24"/>
+          <w:szCs w:val="24"/>
+        </w:rPr>
+        <w:t xml:space="preserve">Poniższa ocena stanowi odpowiedź na zasadnicze pytanie pracy: która architektura systemu zasilania najlepiej realizuje wymóg ciągłości zasilania obiektu infrastruktury krytycznej. Kryterium ekonomiczne pełni w niej rolę podrzędną wobec kryterium niezawodności.</w:t>
       </w:r>
     </w:p>
     <w:p>
@@ -8423,35 +8437,511 @@
           <w:sz w:val="28"/>
           <w:szCs w:val="28"/>
         </w:rPr>
-        <w:t xml:space="preserve">8.1. Kryterium najniższego NPC prowadzi do rozwiązania niedopuszczalnego</w:t>
-      </w:r>
-    </w:p>
-    <w:p>
-      <w:pPr>
-        <w:spacing w:after="120" w:before="0" w:line="360"/>
-        <w:ind w:firstLine="566"/>
-        <w:jc w:val="both"/>
+        <w:t xml:space="preserve">8.1. Kryteria oceny</w:t>
+      </w:r>
+    </w:p>
+    <w:tbl>
+      <w:tblPr>
+        <w:tblW w:type="dxa" w:w="9073"/>
+        <w:tblBorders>
+          <w:top w:val="single" w:color="auto" w:sz="4"/>
+          <w:left w:val="single" w:color="auto" w:sz="4"/>
+          <w:bottom w:val="single" w:color="auto" w:sz="4"/>
+          <w:right w:val="single" w:color="auto" w:sz="4"/>
+          <w:insideH w:val="single" w:color="auto" w:sz="4"/>
+          <w:insideV w:val="single" w:color="auto" w:sz="4"/>
+        </w:tblBorders>
+      </w:tblPr>
+      <w:tblGrid>
+        <w:gridCol w:w="3266"/>
+        <w:gridCol w:w="1452"/>
+        <w:gridCol w:w="4355"/>
+      </w:tblGrid>
+      <w:tr>
+        <w:trPr>
+          <w:tblHeader/>
+        </w:trPr>
+        <w:tc>
+          <w:tcPr>
+            <w:tcW w:type="dxa" w:w="3266"/>
+            <w:shd w:fill="D9E2F3" w:val="clear"/>
+            <w:tcMar>
+              <w:top w:type="dxa" w:w="60"/>
+              <w:left w:type="dxa" w:w="80"/>
+              <w:bottom w:type="dxa" w:w="60"/>
+              <w:right w:type="dxa" w:w="80"/>
+            </w:tcMar>
+          </w:tcPr>
+          <w:p>
+            <w:pPr>
+              <w:spacing w:after="0" w:line="240"/>
+              <w:jc w:val="left"/>
+            </w:pPr>
+            <w:r>
+              <w:rPr>
+                <w:b/>
+                <w:bCs/>
+                <w:sz w:val="20"/>
+                <w:szCs w:val="20"/>
+              </w:rPr>
+              <w:t xml:space="preserve">Kryterium</w:t>
+            </w:r>
+          </w:p>
+        </w:tc>
+        <w:tc>
+          <w:tcPr>
+            <w:tcW w:type="dxa" w:w="1452"/>
+            <w:shd w:fill="D9E2F3" w:val="clear"/>
+            <w:tcMar>
+              <w:top w:type="dxa" w:w="60"/>
+              <w:left w:type="dxa" w:w="80"/>
+              <w:bottom w:type="dxa" w:w="60"/>
+              <w:right w:type="dxa" w:w="80"/>
+            </w:tcMar>
+          </w:tcPr>
+          <w:p>
+            <w:pPr>
+              <w:spacing w:after="0" w:line="240"/>
+              <w:jc w:val="center"/>
+            </w:pPr>
+            <w:r>
+              <w:rPr>
+                <w:b/>
+                <w:bCs/>
+                <w:sz w:val="20"/>
+                <w:szCs w:val="20"/>
+              </w:rPr>
+              <w:t xml:space="preserve">Waga</w:t>
+            </w:r>
+          </w:p>
+        </w:tc>
+        <w:tc>
+          <w:tcPr>
+            <w:tcW w:type="dxa" w:w="4355"/>
+            <w:shd w:fill="D9E2F3" w:val="clear"/>
+            <w:tcMar>
+              <w:top w:type="dxa" w:w="60"/>
+              <w:left w:type="dxa" w:w="80"/>
+              <w:bottom w:type="dxa" w:w="60"/>
+              <w:right w:type="dxa" w:w="80"/>
+            </w:tcMar>
+          </w:tcPr>
+          <w:p>
+            <w:pPr>
+              <w:spacing w:after="0" w:line="240"/>
+              <w:jc w:val="center"/>
+            </w:pPr>
+            <w:r>
+              <w:rPr>
+                <w:b/>
+                <w:bCs/>
+                <w:sz w:val="20"/>
+                <w:szCs w:val="20"/>
+              </w:rPr>
+              <w:t xml:space="preserve">Uzasadnienie</w:t>
+            </w:r>
+          </w:p>
+        </w:tc>
+      </w:tr>
+      <w:tr>
+        <w:trPr>
+          <w:tblHeader w:val="false"/>
+        </w:trPr>
+        <w:tc>
+          <w:tcPr>
+            <w:tcW w:type="dxa" w:w="3266"/>
+            <w:tcMar>
+              <w:top w:type="dxa" w:w="60"/>
+              <w:left w:type="dxa" w:w="80"/>
+              <w:bottom w:type="dxa" w:w="60"/>
+              <w:right w:type="dxa" w:w="80"/>
+            </w:tcMar>
+          </w:tcPr>
+          <w:p>
+            <w:pPr>
+              <w:spacing w:after="0" w:line="240"/>
+              <w:jc w:val="left"/>
+            </w:pPr>
+            <w:r>
+              <w:rPr>
+                <w:sz w:val="20"/>
+                <w:szCs w:val="20"/>
+              </w:rPr>
+              <w:t xml:space="preserve">Energia niedostarczona podczas awarii</w:t>
+            </w:r>
+          </w:p>
+        </w:tc>
+        <w:tc>
+          <w:tcPr>
+            <w:tcW w:type="dxa" w:w="1452"/>
+            <w:tcMar>
+              <w:top w:type="dxa" w:w="60"/>
+              <w:left w:type="dxa" w:w="80"/>
+              <w:bottom w:type="dxa" w:w="60"/>
+              <w:right w:type="dxa" w:w="80"/>
+            </w:tcMar>
+          </w:tcPr>
+          <w:p>
+            <w:pPr>
+              <w:spacing w:after="0" w:line="240"/>
+              <w:jc w:val="center"/>
+            </w:pPr>
+            <w:r>
+              <w:rPr>
+                <w:sz w:val="20"/>
+                <w:szCs w:val="20"/>
+              </w:rPr>
+              <w:t xml:space="preserve">krytyczna</w:t>
+            </w:r>
+          </w:p>
+        </w:tc>
+        <w:tc>
+          <w:tcPr>
+            <w:tcW w:type="dxa" w:w="4355"/>
+            <w:tcMar>
+              <w:top w:type="dxa" w:w="60"/>
+              <w:left w:type="dxa" w:w="80"/>
+              <w:bottom w:type="dxa" w:w="60"/>
+              <w:right w:type="dxa" w:w="80"/>
+            </w:tcMar>
+          </w:tcPr>
+          <w:p>
+            <w:pPr>
+              <w:spacing w:after="0" w:line="240"/>
+              <w:jc w:val="center"/>
+            </w:pPr>
+            <w:r>
+              <w:rPr>
+                <w:sz w:val="20"/>
+                <w:szCs w:val="20"/>
+              </w:rPr>
+              <w:t xml:space="preserve">Bezpośrednie zagrożenie życia pacjentów</w:t>
+            </w:r>
+          </w:p>
+        </w:tc>
+      </w:tr>
+      <w:tr>
+        <w:trPr>
+          <w:tblHeader w:val="false"/>
+        </w:trPr>
+        <w:tc>
+          <w:tcPr>
+            <w:tcW w:type="dxa" w:w="3266"/>
+            <w:tcMar>
+              <w:top w:type="dxa" w:w="60"/>
+              <w:left w:type="dxa" w:w="80"/>
+              <w:bottom w:type="dxa" w:w="60"/>
+              <w:right w:type="dxa" w:w="80"/>
+            </w:tcMar>
+          </w:tcPr>
+          <w:p>
+            <w:pPr>
+              <w:spacing w:after="0" w:line="240"/>
+              <w:jc w:val="left"/>
+            </w:pPr>
+            <w:r>
+              <w:rPr>
+                <w:sz w:val="20"/>
+                <w:szCs w:val="20"/>
+              </w:rPr>
+              <w:t xml:space="preserve">Niezależność od transportu paliwa</w:t>
+            </w:r>
+          </w:p>
+        </w:tc>
+        <w:tc>
+          <w:tcPr>
+            <w:tcW w:type="dxa" w:w="1452"/>
+            <w:tcMar>
+              <w:top w:type="dxa" w:w="60"/>
+              <w:left w:type="dxa" w:w="80"/>
+              <w:bottom w:type="dxa" w:w="60"/>
+              <w:right w:type="dxa" w:w="80"/>
+            </w:tcMar>
+          </w:tcPr>
+          <w:p>
+            <w:pPr>
+              <w:spacing w:after="0" w:line="240"/>
+              <w:jc w:val="center"/>
+            </w:pPr>
+            <w:r>
+              <w:rPr>
+                <w:sz w:val="20"/>
+                <w:szCs w:val="20"/>
+              </w:rPr>
+              <w:t xml:space="preserve">wysoka</w:t>
+            </w:r>
+          </w:p>
+        </w:tc>
+        <w:tc>
+          <w:tcPr>
+            <w:tcW w:type="dxa" w:w="4355"/>
+            <w:tcMar>
+              <w:top w:type="dxa" w:w="60"/>
+              <w:left w:type="dxa" w:w="80"/>
+              <w:bottom w:type="dxa" w:w="60"/>
+              <w:right w:type="dxa" w:w="80"/>
+            </w:tcMar>
+          </w:tcPr>
+          <w:p>
+            <w:pPr>
+              <w:spacing w:after="0" w:line="240"/>
+              <w:jc w:val="center"/>
+            </w:pPr>
+            <w:r>
+              <w:rPr>
+                <w:sz w:val="20"/>
+                <w:szCs w:val="20"/>
+              </w:rPr>
+              <w:t xml:space="preserve">Warunek przetrwania zdarzeń typu black-sky</w:t>
+            </w:r>
+          </w:p>
+        </w:tc>
+      </w:tr>
+      <w:tr>
+        <w:trPr>
+          <w:tblHeader w:val="false"/>
+        </w:trPr>
+        <w:tc>
+          <w:tcPr>
+            <w:tcW w:type="dxa" w:w="3266"/>
+            <w:tcMar>
+              <w:top w:type="dxa" w:w="60"/>
+              <w:left w:type="dxa" w:w="80"/>
+              <w:bottom w:type="dxa" w:w="60"/>
+              <w:right w:type="dxa" w:w="80"/>
+            </w:tcMar>
+          </w:tcPr>
+          <w:p>
+            <w:pPr>
+              <w:spacing w:after="0" w:line="240"/>
+              <w:jc w:val="left"/>
+            </w:pPr>
+            <w:r>
+              <w:rPr>
+                <w:sz w:val="20"/>
+                <w:szCs w:val="20"/>
+              </w:rPr>
+              <w:t xml:space="preserve">Zdolność pokrycia klasy 0,5 s</w:t>
+            </w:r>
+          </w:p>
+        </w:tc>
+        <w:tc>
+          <w:tcPr>
+            <w:tcW w:type="dxa" w:w="1452"/>
+            <w:tcMar>
+              <w:top w:type="dxa" w:w="60"/>
+              <w:left w:type="dxa" w:w="80"/>
+              <w:bottom w:type="dxa" w:w="60"/>
+              <w:right w:type="dxa" w:w="80"/>
+            </w:tcMar>
+          </w:tcPr>
+          <w:p>
+            <w:pPr>
+              <w:spacing w:after="0" w:line="240"/>
+              <w:jc w:val="center"/>
+            </w:pPr>
+            <w:r>
+              <w:rPr>
+                <w:sz w:val="20"/>
+                <w:szCs w:val="20"/>
+              </w:rPr>
+              <w:t xml:space="preserve">wysoka</w:t>
+            </w:r>
+          </w:p>
+        </w:tc>
+        <w:tc>
+          <w:tcPr>
+            <w:tcW w:type="dxa" w:w="4355"/>
+            <w:tcMar>
+              <w:top w:type="dxa" w:w="60"/>
+              <w:left w:type="dxa" w:w="80"/>
+              <w:bottom w:type="dxa" w:w="60"/>
+              <w:right w:type="dxa" w:w="80"/>
+            </w:tcMar>
+          </w:tcPr>
+          <w:p>
+            <w:pPr>
+              <w:spacing w:after="0" w:line="240"/>
+              <w:jc w:val="center"/>
+            </w:pPr>
+            <w:r>
+              <w:rPr>
+                <w:sz w:val="20"/>
+                <w:szCs w:val="20"/>
+              </w:rPr>
+              <w:t xml:space="preserve">Wymóg normy IEC 60364-7-710 dla pomieszczeń grupy 2</w:t>
+            </w:r>
+          </w:p>
+        </w:tc>
+      </w:tr>
+      <w:tr>
+        <w:trPr>
+          <w:tblHeader w:val="false"/>
+        </w:trPr>
+        <w:tc>
+          <w:tcPr>
+            <w:tcW w:type="dxa" w:w="3266"/>
+            <w:tcMar>
+              <w:top w:type="dxa" w:w="60"/>
+              <w:left w:type="dxa" w:w="80"/>
+              <w:bottom w:type="dxa" w:w="60"/>
+              <w:right w:type="dxa" w:w="80"/>
+            </w:tcMar>
+          </w:tcPr>
+          <w:p>
+            <w:pPr>
+              <w:spacing w:after="0" w:line="240"/>
+              <w:jc w:val="left"/>
+            </w:pPr>
+            <w:r>
+              <w:rPr>
+                <w:sz w:val="20"/>
+                <w:szCs w:val="20"/>
+              </w:rPr>
+              <w:t xml:space="preserve">Udział źródeł własnych</w:t>
+            </w:r>
+          </w:p>
+        </w:tc>
+        <w:tc>
+          <w:tcPr>
+            <w:tcW w:type="dxa" w:w="1452"/>
+            <w:tcMar>
+              <w:top w:type="dxa" w:w="60"/>
+              <w:left w:type="dxa" w:w="80"/>
+              <w:bottom w:type="dxa" w:w="60"/>
+              <w:right w:type="dxa" w:w="80"/>
+            </w:tcMar>
+          </w:tcPr>
+          <w:p>
+            <w:pPr>
+              <w:spacing w:after="0" w:line="240"/>
+              <w:jc w:val="center"/>
+            </w:pPr>
+            <w:r>
+              <w:rPr>
+                <w:sz w:val="20"/>
+                <w:szCs w:val="20"/>
+              </w:rPr>
+              <w:t xml:space="preserve">średnia</w:t>
+            </w:r>
+          </w:p>
+        </w:tc>
+        <w:tc>
+          <w:tcPr>
+            <w:tcW w:type="dxa" w:w="4355"/>
+            <w:tcMar>
+              <w:top w:type="dxa" w:w="60"/>
+              <w:left w:type="dxa" w:w="80"/>
+              <w:bottom w:type="dxa" w:w="60"/>
+              <w:right w:type="dxa" w:w="80"/>
+            </w:tcMar>
+          </w:tcPr>
+          <w:p>
+            <w:pPr>
+              <w:spacing w:after="0" w:line="240"/>
+              <w:jc w:val="center"/>
+            </w:pPr>
+            <w:r>
+              <w:rPr>
+                <w:sz w:val="20"/>
+                <w:szCs w:val="20"/>
+              </w:rPr>
+              <w:t xml:space="preserve">Miara odporności na zakłócenia zewnętrzne</w:t>
+            </w:r>
+          </w:p>
+        </w:tc>
+      </w:tr>
+      <w:tr>
+        <w:trPr>
+          <w:tblHeader w:val="false"/>
+        </w:trPr>
+        <w:tc>
+          <w:tcPr>
+            <w:tcW w:type="dxa" w:w="3266"/>
+            <w:tcMar>
+              <w:top w:type="dxa" w:w="60"/>
+              <w:left w:type="dxa" w:w="80"/>
+              <w:bottom w:type="dxa" w:w="60"/>
+              <w:right w:type="dxa" w:w="80"/>
+            </w:tcMar>
+          </w:tcPr>
+          <w:p>
+            <w:pPr>
+              <w:spacing w:after="0" w:line="240"/>
+              <w:jc w:val="left"/>
+            </w:pPr>
+            <w:r>
+              <w:rPr>
+                <w:sz w:val="20"/>
+                <w:szCs w:val="20"/>
+              </w:rPr>
+              <w:t xml:space="preserve">Koszt (NPC, LCOE)</w:t>
+            </w:r>
+          </w:p>
+        </w:tc>
+        <w:tc>
+          <w:tcPr>
+            <w:tcW w:type="dxa" w:w="1452"/>
+            <w:tcMar>
+              <w:top w:type="dxa" w:w="60"/>
+              <w:left w:type="dxa" w:w="80"/>
+              <w:bottom w:type="dxa" w:w="60"/>
+              <w:right w:type="dxa" w:w="80"/>
+            </w:tcMar>
+          </w:tcPr>
+          <w:p>
+            <w:pPr>
+              <w:spacing w:after="0" w:line="240"/>
+              <w:jc w:val="center"/>
+            </w:pPr>
+            <w:r>
+              <w:rPr>
+                <w:sz w:val="20"/>
+                <w:szCs w:val="20"/>
+              </w:rPr>
+              <w:t xml:space="preserve">podrzędna</w:t>
+            </w:r>
+          </w:p>
+        </w:tc>
+        <w:tc>
+          <w:tcPr>
+            <w:tcW w:type="dxa" w:w="4355"/>
+            <w:tcMar>
+              <w:top w:type="dxa" w:w="60"/>
+              <w:left w:type="dxa" w:w="80"/>
+              <w:bottom w:type="dxa" w:w="60"/>
+              <w:right w:type="dxa" w:w="80"/>
+            </w:tcMar>
+          </w:tcPr>
+          <w:p>
+            <w:pPr>
+              <w:spacing w:after="0" w:line="240"/>
+              <w:jc w:val="center"/>
+            </w:pPr>
+            <w:r>
+              <w:rPr>
+                <w:sz w:val="20"/>
+                <w:szCs w:val="20"/>
+              </w:rPr>
+              <w:t xml:space="preserve">Kryterium wtórne wobec bezpieczeństwa</w:t>
+            </w:r>
+          </w:p>
+        </w:tc>
+      </w:tr>
+    </w:tbl>
+    <w:p>
+      <w:pPr>
+        <w:spacing w:after="200" w:before="80" w:line="240"/>
+        <w:jc w:val="center"/>
       </w:pPr>
       <w:r>
         <w:rPr>
-          <w:sz w:val="24"/>
-          <w:szCs w:val="24"/>
+          <w:i/>
+          <w:iCs/>
+          <w:sz w:val="20"/>
+          <w:szCs w:val="20"/>
         </w:rPr>
-        <w:t xml:space="preserve">We wszystkich wariantach awaryjnych konfiguracją o najniższym koszcie bieżącym netto pozostaje układ pozbawiony źródła rezerwowego — ten sam, który generuje kilka tysięcy kilowatogodzin energii niedostarczonej. Optymalizator uznaje niedostarczenie energii do szpitala za rozwiązanie tańsze niż zakup źródła rezerwowego. Koszt zapewnienia pełnego pokrycia wynosi około 220 000 $ w kategoriach NPC, co odpowiada wzrostowi LCOE o 16%.</w:t>
-      </w:r>
-    </w:p>
-    <w:p>
-      <w:pPr>
-        <w:spacing w:after="120" w:before="0" w:line="360"/>
-        <w:ind w:firstLine="566"/>
-        <w:jc w:val="both"/>
-      </w:pPr>
-      <w:r>
-        <w:rPr>
-          <w:sz w:val="24"/>
-          <w:szCs w:val="24"/>
-        </w:rPr>
-        <w:t xml:space="preserve">Konsekwencją dla dalszego toku pracy jest konieczność traktowania energii niedostarczonej jako ograniczenia twardego, nie zaś jako składnika funkcji celu.</w:t>
+        <w:t xml:space="preserve">Tabela 15. Kryteria oceny konfiguracji pod kątem bezpieczeństwa energetycznego</w:t>
       </w:r>
     </w:p>
     <w:p>
@@ -8466,21 +8956,1075 @@
           <w:sz w:val="28"/>
           <w:szCs w:val="28"/>
         </w:rPr>
-        <w:t xml:space="preserve">8.2. Ograniczenie przestrzenne warunkiem wiarygodności wyników</w:t>
-      </w:r>
-    </w:p>
-    <w:p>
-      <w:pPr>
-        <w:spacing w:after="120" w:before="0" w:line="360"/>
-        <w:ind w:firstLine="566"/>
+        <w:t xml:space="preserve">8.2. Ocena porównawcza</w:t>
+      </w:r>
+    </w:p>
+    <w:tbl>
+      <w:tblPr>
+        <w:tblW w:type="dxa" w:w="9073"/>
+        <w:tblBorders>
+          <w:top w:val="single" w:color="auto" w:sz="4"/>
+          <w:left w:val="single" w:color="auto" w:sz="4"/>
+          <w:bottom w:val="single" w:color="auto" w:sz="4"/>
+          <w:right w:val="single" w:color="auto" w:sz="4"/>
+          <w:insideH w:val="single" w:color="auto" w:sz="4"/>
+          <w:insideV w:val="single" w:color="auto" w:sz="4"/>
+        </w:tblBorders>
+      </w:tblPr>
+      <w:tblGrid>
+        <w:gridCol w:w="3085"/>
+        <w:gridCol w:w="1996"/>
+        <w:gridCol w:w="1996"/>
+        <w:gridCol w:w="1996"/>
+      </w:tblGrid>
+      <w:tr>
+        <w:trPr>
+          <w:tblHeader/>
+        </w:trPr>
+        <w:tc>
+          <w:tcPr>
+            <w:tcW w:type="dxa" w:w="3085"/>
+            <w:shd w:fill="D9E2F3" w:val="clear"/>
+            <w:tcMar>
+              <w:top w:type="dxa" w:w="60"/>
+              <w:left w:type="dxa" w:w="80"/>
+              <w:bottom w:type="dxa" w:w="60"/>
+              <w:right w:type="dxa" w:w="80"/>
+            </w:tcMar>
+          </w:tcPr>
+          <w:p>
+            <w:pPr>
+              <w:spacing w:after="0" w:line="240"/>
+              <w:jc w:val="left"/>
+            </w:pPr>
+            <w:r>
+              <w:rPr>
+                <w:b/>
+                <w:bCs/>
+                <w:sz w:val="20"/>
+                <w:szCs w:val="20"/>
+              </w:rPr>
+              <w:t xml:space="preserve">Kryterium</w:t>
+            </w:r>
+          </w:p>
+        </w:tc>
+        <w:tc>
+          <w:tcPr>
+            <w:tcW w:type="dxa" w:w="1996"/>
+            <w:shd w:fill="D9E2F3" w:val="clear"/>
+            <w:tcMar>
+              <w:top w:type="dxa" w:w="60"/>
+              <w:left w:type="dxa" w:w="80"/>
+              <w:bottom w:type="dxa" w:w="60"/>
+              <w:right w:type="dxa" w:w="80"/>
+            </w:tcMar>
+          </w:tcPr>
+          <w:p>
+            <w:pPr>
+              <w:spacing w:after="0" w:line="240"/>
+              <w:jc w:val="center"/>
+            </w:pPr>
+            <w:r>
+              <w:rPr>
+                <w:b/>
+                <w:bCs/>
+                <w:sz w:val="20"/>
+                <w:szCs w:val="20"/>
+              </w:rPr>
+              <w:t xml:space="preserve">K1 Baza</w:t>
+            </w:r>
+          </w:p>
+        </w:tc>
+        <w:tc>
+          <w:tcPr>
+            <w:tcW w:type="dxa" w:w="1996"/>
+            <w:shd w:fill="D9E2F3" w:val="clear"/>
+            <w:tcMar>
+              <w:top w:type="dxa" w:w="60"/>
+              <w:left w:type="dxa" w:w="80"/>
+              <w:bottom w:type="dxa" w:w="60"/>
+              <w:right w:type="dxa" w:w="80"/>
+            </w:tcMar>
+          </w:tcPr>
+          <w:p>
+            <w:pPr>
+              <w:spacing w:after="0" w:line="240"/>
+              <w:jc w:val="center"/>
+            </w:pPr>
+            <w:r>
+              <w:rPr>
+                <w:b/>
+                <w:bCs/>
+                <w:sz w:val="20"/>
+                <w:szCs w:val="20"/>
+              </w:rPr>
+              <w:t xml:space="preserve">K2 Hybryda</w:t>
+            </w:r>
+          </w:p>
+        </w:tc>
+        <w:tc>
+          <w:tcPr>
+            <w:tcW w:type="dxa" w:w="1996"/>
+            <w:shd w:fill="D9E2F3" w:val="clear"/>
+            <w:tcMar>
+              <w:top w:type="dxa" w:w="60"/>
+              <w:left w:type="dxa" w:w="80"/>
+              <w:bottom w:type="dxa" w:w="60"/>
+              <w:right w:type="dxa" w:w="80"/>
+            </w:tcMar>
+          </w:tcPr>
+          <w:p>
+            <w:pPr>
+              <w:spacing w:after="0" w:line="240"/>
+              <w:jc w:val="center"/>
+            </w:pPr>
+            <w:r>
+              <w:rPr>
+                <w:b/>
+                <w:bCs/>
+                <w:sz w:val="20"/>
+                <w:szCs w:val="20"/>
+              </w:rPr>
+              <w:t xml:space="preserve">K3 Mikrosieć</w:t>
+            </w:r>
+          </w:p>
+        </w:tc>
+      </w:tr>
+      <w:tr>
+        <w:trPr>
+          <w:tblHeader w:val="false"/>
+        </w:trPr>
+        <w:tc>
+          <w:tcPr>
+            <w:tcW w:type="dxa" w:w="3085"/>
+            <w:tcMar>
+              <w:top w:type="dxa" w:w="60"/>
+              <w:left w:type="dxa" w:w="80"/>
+              <w:bottom w:type="dxa" w:w="60"/>
+              <w:right w:type="dxa" w:w="80"/>
+            </w:tcMar>
+          </w:tcPr>
+          <w:p>
+            <w:pPr>
+              <w:spacing w:after="0" w:line="240"/>
+              <w:jc w:val="left"/>
+            </w:pPr>
+            <w:r>
+              <w:rPr>
+                <w:b w:val="false"/>
+                <w:bCs w:val="false"/>
+                <w:sz w:val="20"/>
+                <w:szCs w:val="20"/>
+              </w:rPr>
+              <w:t xml:space="preserve">Energia niedostarczona (A1, 72 h)</w:t>
+            </w:r>
+          </w:p>
+        </w:tc>
+        <w:tc>
+          <w:tcPr>
+            <w:tcW w:type="dxa" w:w="1996"/>
+            <w:tcMar>
+              <w:top w:type="dxa" w:w="60"/>
+              <w:left w:type="dxa" w:w="80"/>
+              <w:bottom w:type="dxa" w:w="60"/>
+              <w:right w:type="dxa" w:w="80"/>
+            </w:tcMar>
+          </w:tcPr>
+          <w:p>
+            <w:pPr>
+              <w:spacing w:after="0" w:line="240"/>
+              <w:jc w:val="center"/>
+            </w:pPr>
+            <w:r>
+              <w:rPr>
+                <w:b w:val="false"/>
+                <w:bCs w:val="false"/>
+                <w:sz w:val="20"/>
+                <w:szCs w:val="20"/>
+              </w:rPr>
+              <w:t xml:space="preserve">0 kWh *</w:t>
+            </w:r>
+          </w:p>
+        </w:tc>
+        <w:tc>
+          <w:tcPr>
+            <w:tcW w:type="dxa" w:w="1996"/>
+            <w:tcMar>
+              <w:top w:type="dxa" w:w="60"/>
+              <w:left w:type="dxa" w:w="80"/>
+              <w:bottom w:type="dxa" w:w="60"/>
+              <w:right w:type="dxa" w:w="80"/>
+            </w:tcMar>
+          </w:tcPr>
+          <w:p>
+            <w:pPr>
+              <w:spacing w:after="0" w:line="240"/>
+              <w:jc w:val="center"/>
+            </w:pPr>
+            <w:r>
+              <w:rPr>
+                <w:b w:val="false"/>
+                <w:bCs w:val="false"/>
+                <w:sz w:val="20"/>
+                <w:szCs w:val="20"/>
+              </w:rPr>
+              <w:t xml:space="preserve">7 966 kWh</w:t>
+            </w:r>
+          </w:p>
+        </w:tc>
+        <w:tc>
+          <w:tcPr>
+            <w:tcW w:type="dxa" w:w="1996"/>
+            <w:tcMar>
+              <w:top w:type="dxa" w:w="60"/>
+              <w:left w:type="dxa" w:w="80"/>
+              <w:bottom w:type="dxa" w:w="60"/>
+              <w:right w:type="dxa" w:w="80"/>
+            </w:tcMar>
+          </w:tcPr>
+          <w:p>
+            <w:pPr>
+              <w:spacing w:after="0" w:line="240"/>
+              <w:jc w:val="center"/>
+            </w:pPr>
+            <w:r>
+              <w:rPr>
+                <w:b w:val="false"/>
+                <w:bCs w:val="false"/>
+                <w:sz w:val="20"/>
+                <w:szCs w:val="20"/>
+              </w:rPr>
+              <w:t xml:space="preserve">1 046 kWh</w:t>
+            </w:r>
+          </w:p>
+        </w:tc>
+      </w:tr>
+      <w:tr>
+        <w:trPr>
+          <w:tblHeader w:val="false"/>
+        </w:trPr>
+        <w:tc>
+          <w:tcPr>
+            <w:tcW w:type="dxa" w:w="3085"/>
+            <w:tcMar>
+              <w:top w:type="dxa" w:w="60"/>
+              <w:left w:type="dxa" w:w="80"/>
+              <w:bottom w:type="dxa" w:w="60"/>
+              <w:right w:type="dxa" w:w="80"/>
+            </w:tcMar>
+          </w:tcPr>
+          <w:p>
+            <w:pPr>
+              <w:spacing w:after="0" w:line="240"/>
+              <w:jc w:val="left"/>
+            </w:pPr>
+            <w:r>
+              <w:rPr>
+                <w:b w:val="false"/>
+                <w:bCs w:val="false"/>
+                <w:sz w:val="20"/>
+                <w:szCs w:val="20"/>
+              </w:rPr>
+              <w:t xml:space="preserve">Energia niedostarczona (A2)</w:t>
+            </w:r>
+          </w:p>
+        </w:tc>
+        <w:tc>
+          <w:tcPr>
+            <w:tcW w:type="dxa" w:w="1996"/>
+            <w:tcMar>
+              <w:top w:type="dxa" w:w="60"/>
+              <w:left w:type="dxa" w:w="80"/>
+              <w:bottom w:type="dxa" w:w="60"/>
+              <w:right w:type="dxa" w:w="80"/>
+            </w:tcMar>
+          </w:tcPr>
+          <w:p>
+            <w:pPr>
+              <w:spacing w:after="0" w:line="240"/>
+              <w:jc w:val="center"/>
+            </w:pPr>
+            <w:r>
+              <w:rPr>
+                <w:b w:val="false"/>
+                <w:bCs w:val="false"/>
+                <w:sz w:val="20"/>
+                <w:szCs w:val="20"/>
+              </w:rPr>
+              <w:t xml:space="preserve">0 kWh *</w:t>
+            </w:r>
+          </w:p>
+        </w:tc>
+        <w:tc>
+          <w:tcPr>
+            <w:tcW w:type="dxa" w:w="1996"/>
+            <w:tcMar>
+              <w:top w:type="dxa" w:w="60"/>
+              <w:left w:type="dxa" w:w="80"/>
+              <w:bottom w:type="dxa" w:w="60"/>
+              <w:right w:type="dxa" w:w="80"/>
+            </w:tcMar>
+          </w:tcPr>
+          <w:p>
+            <w:pPr>
+              <w:spacing w:after="0" w:line="240"/>
+              <w:jc w:val="center"/>
+            </w:pPr>
+            <w:r>
+              <w:rPr>
+                <w:b w:val="false"/>
+                <w:bCs w:val="false"/>
+                <w:sz w:val="20"/>
+                <w:szCs w:val="20"/>
+              </w:rPr>
+              <w:t xml:space="preserve">—</w:t>
+            </w:r>
+          </w:p>
+        </w:tc>
+        <w:tc>
+          <w:tcPr>
+            <w:tcW w:type="dxa" w:w="1996"/>
+            <w:tcMar>
+              <w:top w:type="dxa" w:w="60"/>
+              <w:left w:type="dxa" w:w="80"/>
+              <w:bottom w:type="dxa" w:w="60"/>
+              <w:right w:type="dxa" w:w="80"/>
+            </w:tcMar>
+          </w:tcPr>
+          <w:p>
+            <w:pPr>
+              <w:spacing w:after="0" w:line="240"/>
+              <w:jc w:val="center"/>
+            </w:pPr>
+            <w:r>
+              <w:rPr>
+                <w:b w:val="false"/>
+                <w:bCs w:val="false"/>
+                <w:sz w:val="20"/>
+                <w:szCs w:val="20"/>
+              </w:rPr>
+              <w:t xml:space="preserve">279 kWh</w:t>
+            </w:r>
+          </w:p>
+        </w:tc>
+      </w:tr>
+      <w:tr>
+        <w:trPr>
+          <w:tblHeader w:val="false"/>
+        </w:trPr>
+        <w:tc>
+          <w:tcPr>
+            <w:tcW w:type="dxa" w:w="3085"/>
+            <w:tcMar>
+              <w:top w:type="dxa" w:w="60"/>
+              <w:left w:type="dxa" w:w="80"/>
+              <w:bottom w:type="dxa" w:w="60"/>
+              <w:right w:type="dxa" w:w="80"/>
+            </w:tcMar>
+          </w:tcPr>
+          <w:p>
+            <w:pPr>
+              <w:spacing w:after="0" w:line="240"/>
+              <w:jc w:val="left"/>
+            </w:pPr>
+            <w:r>
+              <w:rPr>
+                <w:b w:val="false"/>
+                <w:bCs w:val="false"/>
+                <w:sz w:val="20"/>
+                <w:szCs w:val="20"/>
+              </w:rPr>
+              <w:t xml:space="preserve">Czas autonomii bez uzupełnienia paliwa</w:t>
+            </w:r>
+          </w:p>
+        </w:tc>
+        <w:tc>
+          <w:tcPr>
+            <w:tcW w:type="dxa" w:w="1996"/>
+            <w:tcMar>
+              <w:top w:type="dxa" w:w="60"/>
+              <w:left w:type="dxa" w:w="80"/>
+              <w:bottom w:type="dxa" w:w="60"/>
+              <w:right w:type="dxa" w:w="80"/>
+            </w:tcMar>
+          </w:tcPr>
+          <w:p>
+            <w:pPr>
+              <w:spacing w:after="0" w:line="240"/>
+              <w:jc w:val="center"/>
+            </w:pPr>
+            <w:r>
+              <w:rPr>
+                <w:b w:val="false"/>
+                <w:bCs w:val="false"/>
+                <w:sz w:val="20"/>
+                <w:szCs w:val="20"/>
+              </w:rPr>
+              <w:t xml:space="preserve">30–45 h **</w:t>
+            </w:r>
+          </w:p>
+        </w:tc>
+        <w:tc>
+          <w:tcPr>
+            <w:tcW w:type="dxa" w:w="1996"/>
+            <w:tcMar>
+              <w:top w:type="dxa" w:w="60"/>
+              <w:left w:type="dxa" w:w="80"/>
+              <w:bottom w:type="dxa" w:w="60"/>
+              <w:right w:type="dxa" w:w="80"/>
+            </w:tcMar>
+          </w:tcPr>
+          <w:p>
+            <w:pPr>
+              <w:spacing w:after="0" w:line="240"/>
+              <w:jc w:val="center"/>
+            </w:pPr>
+            <w:r>
+              <w:rPr>
+                <w:b w:val="false"/>
+                <w:bCs w:val="false"/>
+                <w:sz w:val="20"/>
+                <w:szCs w:val="20"/>
+              </w:rPr>
+              <w:t xml:space="preserve">ok. 1 h</w:t>
+            </w:r>
+          </w:p>
+        </w:tc>
+        <w:tc>
+          <w:tcPr>
+            <w:tcW w:type="dxa" w:w="1996"/>
+            <w:tcMar>
+              <w:top w:type="dxa" w:w="60"/>
+              <w:left w:type="dxa" w:w="80"/>
+              <w:bottom w:type="dxa" w:w="60"/>
+              <w:right w:type="dxa" w:w="80"/>
+            </w:tcMar>
+          </w:tcPr>
+          <w:p>
+            <w:pPr>
+              <w:spacing w:after="0" w:line="240"/>
+              <w:jc w:val="center"/>
+            </w:pPr>
+            <w:r>
+              <w:rPr>
+                <w:b w:val="false"/>
+                <w:bCs w:val="false"/>
+                <w:sz w:val="20"/>
+                <w:szCs w:val="20"/>
+              </w:rPr>
+              <w:t xml:space="preserve">nieograniczony ***</w:t>
+            </w:r>
+          </w:p>
+        </w:tc>
+      </w:tr>
+      <w:tr>
+        <w:trPr>
+          <w:tblHeader w:val="false"/>
+        </w:trPr>
+        <w:tc>
+          <w:tcPr>
+            <w:tcW w:type="dxa" w:w="3085"/>
+            <w:tcMar>
+              <w:top w:type="dxa" w:w="60"/>
+              <w:left w:type="dxa" w:w="80"/>
+              <w:bottom w:type="dxa" w:w="60"/>
+              <w:right w:type="dxa" w:w="80"/>
+            </w:tcMar>
+          </w:tcPr>
+          <w:p>
+            <w:pPr>
+              <w:spacing w:after="0" w:line="240"/>
+              <w:jc w:val="left"/>
+            </w:pPr>
+            <w:r>
+              <w:rPr>
+                <w:b w:val="false"/>
+                <w:bCs w:val="false"/>
+                <w:sz w:val="20"/>
+                <w:szCs w:val="20"/>
+              </w:rPr>
+              <w:t xml:space="preserve">Niezależność od transportu drogowego</w:t>
+            </w:r>
+          </w:p>
+        </w:tc>
+        <w:tc>
+          <w:tcPr>
+            <w:tcW w:type="dxa" w:w="1996"/>
+            <w:tcMar>
+              <w:top w:type="dxa" w:w="60"/>
+              <w:left w:type="dxa" w:w="80"/>
+              <w:bottom w:type="dxa" w:w="60"/>
+              <w:right w:type="dxa" w:w="80"/>
+            </w:tcMar>
+          </w:tcPr>
+          <w:p>
+            <w:pPr>
+              <w:spacing w:after="0" w:line="240"/>
+              <w:jc w:val="center"/>
+            </w:pPr>
+            <w:r>
+              <w:rPr>
+                <w:b w:val="false"/>
+                <w:bCs w:val="false"/>
+                <w:sz w:val="20"/>
+                <w:szCs w:val="20"/>
+              </w:rPr>
+              <w:t xml:space="preserve">NIE</w:t>
+            </w:r>
+          </w:p>
+        </w:tc>
+        <w:tc>
+          <w:tcPr>
+            <w:tcW w:type="dxa" w:w="1996"/>
+            <w:tcMar>
+              <w:top w:type="dxa" w:w="60"/>
+              <w:left w:type="dxa" w:w="80"/>
+              <w:bottom w:type="dxa" w:w="60"/>
+              <w:right w:type="dxa" w:w="80"/>
+            </w:tcMar>
+          </w:tcPr>
+          <w:p>
+            <w:pPr>
+              <w:spacing w:after="0" w:line="240"/>
+              <w:jc w:val="center"/>
+            </w:pPr>
+            <w:r>
+              <w:rPr>
+                <w:b w:val="false"/>
+                <w:bCs w:val="false"/>
+                <w:sz w:val="20"/>
+                <w:szCs w:val="20"/>
+              </w:rPr>
+              <w:t xml:space="preserve">tak</w:t>
+            </w:r>
+          </w:p>
+        </w:tc>
+        <w:tc>
+          <w:tcPr>
+            <w:tcW w:type="dxa" w:w="1996"/>
+            <w:tcMar>
+              <w:top w:type="dxa" w:w="60"/>
+              <w:left w:type="dxa" w:w="80"/>
+              <w:bottom w:type="dxa" w:w="60"/>
+              <w:right w:type="dxa" w:w="80"/>
+            </w:tcMar>
+          </w:tcPr>
+          <w:p>
+            <w:pPr>
+              <w:spacing w:after="0" w:line="240"/>
+              <w:jc w:val="center"/>
+            </w:pPr>
+            <w:r>
+              <w:rPr>
+                <w:b w:val="false"/>
+                <w:bCs w:val="false"/>
+                <w:sz w:val="20"/>
+                <w:szCs w:val="20"/>
+              </w:rPr>
+              <w:t xml:space="preserve">TAK</w:t>
+            </w:r>
+          </w:p>
+        </w:tc>
+      </w:tr>
+      <w:tr>
+        <w:trPr>
+          <w:tblHeader w:val="false"/>
+        </w:trPr>
+        <w:tc>
+          <w:tcPr>
+            <w:tcW w:type="dxa" w:w="3085"/>
+            <w:tcMar>
+              <w:top w:type="dxa" w:w="60"/>
+              <w:left w:type="dxa" w:w="80"/>
+              <w:bottom w:type="dxa" w:w="60"/>
+              <w:right w:type="dxa" w:w="80"/>
+            </w:tcMar>
+          </w:tcPr>
+          <w:p>
+            <w:pPr>
+              <w:spacing w:after="0" w:line="240"/>
+              <w:jc w:val="left"/>
+            </w:pPr>
+            <w:r>
+              <w:rPr>
+                <w:b w:val="false"/>
+                <w:bCs w:val="false"/>
+                <w:sz w:val="20"/>
+                <w:szCs w:val="20"/>
+              </w:rPr>
+              <w:t xml:space="preserve">Pokrycie klasy 0,5 s</w:t>
+            </w:r>
+          </w:p>
+        </w:tc>
+        <w:tc>
+          <w:tcPr>
+            <w:tcW w:type="dxa" w:w="1996"/>
+            <w:tcMar>
+              <w:top w:type="dxa" w:w="60"/>
+              <w:left w:type="dxa" w:w="80"/>
+              <w:bottom w:type="dxa" w:w="60"/>
+              <w:right w:type="dxa" w:w="80"/>
+            </w:tcMar>
+          </w:tcPr>
+          <w:p>
+            <w:pPr>
+              <w:spacing w:after="0" w:line="240"/>
+              <w:jc w:val="center"/>
+            </w:pPr>
+            <w:r>
+              <w:rPr>
+                <w:b w:val="false"/>
+                <w:bCs w:val="false"/>
+                <w:sz w:val="20"/>
+                <w:szCs w:val="20"/>
+              </w:rPr>
+              <w:t xml:space="preserve">NIE</w:t>
+            </w:r>
+          </w:p>
+        </w:tc>
+        <w:tc>
+          <w:tcPr>
+            <w:tcW w:type="dxa" w:w="1996"/>
+            <w:tcMar>
+              <w:top w:type="dxa" w:w="60"/>
+              <w:left w:type="dxa" w:w="80"/>
+              <w:bottom w:type="dxa" w:w="60"/>
+              <w:right w:type="dxa" w:w="80"/>
+            </w:tcMar>
+          </w:tcPr>
+          <w:p>
+            <w:pPr>
+              <w:spacing w:after="0" w:line="240"/>
+              <w:jc w:val="center"/>
+            </w:pPr>
+            <w:r>
+              <w:rPr>
+                <w:b w:val="false"/>
+                <w:bCs w:val="false"/>
+                <w:sz w:val="20"/>
+                <w:szCs w:val="20"/>
+              </w:rPr>
+              <w:t xml:space="preserve">TAK</w:t>
+            </w:r>
+          </w:p>
+        </w:tc>
+        <w:tc>
+          <w:tcPr>
+            <w:tcW w:type="dxa" w:w="1996"/>
+            <w:tcMar>
+              <w:top w:type="dxa" w:w="60"/>
+              <w:left w:type="dxa" w:w="80"/>
+              <w:bottom w:type="dxa" w:w="60"/>
+              <w:right w:type="dxa" w:w="80"/>
+            </w:tcMar>
+          </w:tcPr>
+          <w:p>
+            <w:pPr>
+              <w:spacing w:after="0" w:line="240"/>
+              <w:jc w:val="center"/>
+            </w:pPr>
+            <w:r>
+              <w:rPr>
+                <w:b w:val="false"/>
+                <w:bCs w:val="false"/>
+                <w:sz w:val="20"/>
+                <w:szCs w:val="20"/>
+              </w:rPr>
+              <w:t xml:space="preserve">TAK</w:t>
+            </w:r>
+          </w:p>
+        </w:tc>
+      </w:tr>
+      <w:tr>
+        <w:trPr>
+          <w:tblHeader w:val="false"/>
+        </w:trPr>
+        <w:tc>
+          <w:tcPr>
+            <w:tcW w:type="dxa" w:w="3085"/>
+            <w:tcMar>
+              <w:top w:type="dxa" w:w="60"/>
+              <w:left w:type="dxa" w:w="80"/>
+              <w:bottom w:type="dxa" w:w="60"/>
+              <w:right w:type="dxa" w:w="80"/>
+            </w:tcMar>
+          </w:tcPr>
+          <w:p>
+            <w:pPr>
+              <w:spacing w:after="0" w:line="240"/>
+              <w:jc w:val="left"/>
+            </w:pPr>
+            <w:r>
+              <w:rPr>
+                <w:b w:val="false"/>
+                <w:bCs w:val="false"/>
+                <w:sz w:val="20"/>
+                <w:szCs w:val="20"/>
+              </w:rPr>
+              <w:t xml:space="preserve">Udział źródeł własnych</w:t>
+            </w:r>
+          </w:p>
+        </w:tc>
+        <w:tc>
+          <w:tcPr>
+            <w:tcW w:type="dxa" w:w="1996"/>
+            <w:tcMar>
+              <w:top w:type="dxa" w:w="60"/>
+              <w:left w:type="dxa" w:w="80"/>
+              <w:bottom w:type="dxa" w:w="60"/>
+              <w:right w:type="dxa" w:w="80"/>
+            </w:tcMar>
+          </w:tcPr>
+          <w:p>
+            <w:pPr>
+              <w:spacing w:after="0" w:line="240"/>
+              <w:jc w:val="center"/>
+            </w:pPr>
+            <w:r>
+              <w:rPr>
+                <w:b w:val="false"/>
+                <w:bCs w:val="false"/>
+                <w:sz w:val="20"/>
+                <w:szCs w:val="20"/>
+              </w:rPr>
+              <w:t xml:space="preserve">0%</w:t>
+            </w:r>
+          </w:p>
+        </w:tc>
+        <w:tc>
+          <w:tcPr>
+            <w:tcW w:type="dxa" w:w="1996"/>
+            <w:tcMar>
+              <w:top w:type="dxa" w:w="60"/>
+              <w:left w:type="dxa" w:w="80"/>
+              <w:bottom w:type="dxa" w:w="60"/>
+              <w:right w:type="dxa" w:w="80"/>
+            </w:tcMar>
+          </w:tcPr>
+          <w:p>
+            <w:pPr>
+              <w:spacing w:after="0" w:line="240"/>
+              <w:jc w:val="center"/>
+            </w:pPr>
+            <w:r>
+              <w:rPr>
+                <w:b w:val="false"/>
+                <w:bCs w:val="false"/>
+                <w:sz w:val="20"/>
+                <w:szCs w:val="20"/>
+              </w:rPr>
+              <w:t xml:space="preserve">21,0%</w:t>
+            </w:r>
+          </w:p>
+        </w:tc>
+        <w:tc>
+          <w:tcPr>
+            <w:tcW w:type="dxa" w:w="1996"/>
+            <w:tcMar>
+              <w:top w:type="dxa" w:w="60"/>
+              <w:left w:type="dxa" w:w="80"/>
+              <w:bottom w:type="dxa" w:w="60"/>
+              <w:right w:type="dxa" w:w="80"/>
+            </w:tcMar>
+          </w:tcPr>
+          <w:p>
+            <w:pPr>
+              <w:spacing w:after="0" w:line="240"/>
+              <w:jc w:val="center"/>
+            </w:pPr>
+            <w:r>
+              <w:rPr>
+                <w:b w:val="false"/>
+                <w:bCs w:val="false"/>
+                <w:sz w:val="20"/>
+                <w:szCs w:val="20"/>
+              </w:rPr>
+              <w:t xml:space="preserve">87,3%</w:t>
+            </w:r>
+          </w:p>
+        </w:tc>
+      </w:tr>
+      <w:tr>
+        <w:trPr>
+          <w:tblHeader w:val="false"/>
+        </w:trPr>
+        <w:tc>
+          <w:tcPr>
+            <w:tcW w:type="dxa" w:w="3085"/>
+            <w:tcMar>
+              <w:top w:type="dxa" w:w="60"/>
+              <w:left w:type="dxa" w:w="80"/>
+              <w:bottom w:type="dxa" w:w="60"/>
+              <w:right w:type="dxa" w:w="80"/>
+            </w:tcMar>
+          </w:tcPr>
+          <w:p>
+            <w:pPr>
+              <w:spacing w:after="0" w:line="240"/>
+              <w:jc w:val="left"/>
+            </w:pPr>
+            <w:r>
+              <w:rPr>
+                <w:b w:val="false"/>
+                <w:bCs w:val="false"/>
+                <w:sz w:val="20"/>
+                <w:szCs w:val="20"/>
+              </w:rPr>
+              <w:t xml:space="preserve">Praca poza awarią</w:t>
+            </w:r>
+          </w:p>
+        </w:tc>
+        <w:tc>
+          <w:tcPr>
+            <w:tcW w:type="dxa" w:w="1996"/>
+            <w:tcMar>
+              <w:top w:type="dxa" w:w="60"/>
+              <w:left w:type="dxa" w:w="80"/>
+              <w:bottom w:type="dxa" w:w="60"/>
+              <w:right w:type="dxa" w:w="80"/>
+            </w:tcMar>
+          </w:tcPr>
+          <w:p>
+            <w:pPr>
+              <w:spacing w:after="0" w:line="240"/>
+              <w:jc w:val="center"/>
+            </w:pPr>
+            <w:r>
+              <w:rPr>
+                <w:b w:val="false"/>
+                <w:bCs w:val="false"/>
+                <w:sz w:val="20"/>
+                <w:szCs w:val="20"/>
+              </w:rPr>
+              <w:t xml:space="preserve">0 h/rok</w:t>
+            </w:r>
+          </w:p>
+        </w:tc>
+        <w:tc>
+          <w:tcPr>
+            <w:tcW w:type="dxa" w:w="1996"/>
+            <w:tcMar>
+              <w:top w:type="dxa" w:w="60"/>
+              <w:left w:type="dxa" w:w="80"/>
+              <w:bottom w:type="dxa" w:w="60"/>
+              <w:right w:type="dxa" w:w="80"/>
+            </w:tcMar>
+          </w:tcPr>
+          <w:p>
+            <w:pPr>
+              <w:spacing w:after="0" w:line="240"/>
+              <w:jc w:val="center"/>
+            </w:pPr>
+            <w:r>
+              <w:rPr>
+                <w:b w:val="false"/>
+                <w:bCs w:val="false"/>
+                <w:sz w:val="20"/>
+                <w:szCs w:val="20"/>
+              </w:rPr>
+              <w:t xml:space="preserve">—</w:t>
+            </w:r>
+          </w:p>
+        </w:tc>
+        <w:tc>
+          <w:tcPr>
+            <w:tcW w:type="dxa" w:w="1996"/>
+            <w:tcMar>
+              <w:top w:type="dxa" w:w="60"/>
+              <w:left w:type="dxa" w:w="80"/>
+              <w:bottom w:type="dxa" w:w="60"/>
+              <w:right w:type="dxa" w:w="80"/>
+            </w:tcMar>
+          </w:tcPr>
+          <w:p>
+            <w:pPr>
+              <w:spacing w:after="0" w:line="240"/>
+              <w:jc w:val="center"/>
+            </w:pPr>
+            <w:r>
+              <w:rPr>
+                <w:b w:val="false"/>
+                <w:bCs w:val="false"/>
+                <w:sz w:val="20"/>
+                <w:szCs w:val="20"/>
+              </w:rPr>
+              <w:t xml:space="preserve">7 112 h/rok</w:t>
+            </w:r>
+          </w:p>
+        </w:tc>
+      </w:tr>
+      <w:tr>
+        <w:trPr>
+          <w:tblHeader w:val="false"/>
+        </w:trPr>
+        <w:tc>
+          <w:tcPr>
+            <w:tcW w:type="dxa" w:w="3085"/>
+            <w:shd w:fill="FFF2CC" w:val="clear"/>
+            <w:tcMar>
+              <w:top w:type="dxa" w:w="60"/>
+              <w:left w:type="dxa" w:w="80"/>
+              <w:bottom w:type="dxa" w:w="60"/>
+              <w:right w:type="dxa" w:w="80"/>
+            </w:tcMar>
+          </w:tcPr>
+          <w:p>
+            <w:pPr>
+              <w:spacing w:after="0" w:line="240"/>
+              <w:jc w:val="left"/>
+            </w:pPr>
+            <w:r>
+              <w:rPr>
+                <w:b/>
+                <w:bCs/>
+                <w:sz w:val="20"/>
+                <w:szCs w:val="20"/>
+              </w:rPr>
+              <w:t xml:space="preserve">LCOE [$/kWh]</w:t>
+            </w:r>
+          </w:p>
+        </w:tc>
+        <w:tc>
+          <w:tcPr>
+            <w:tcW w:type="dxa" w:w="1996"/>
+            <w:shd w:fill="FFF2CC" w:val="clear"/>
+            <w:tcMar>
+              <w:top w:type="dxa" w:w="60"/>
+              <w:left w:type="dxa" w:w="80"/>
+              <w:bottom w:type="dxa" w:w="60"/>
+              <w:right w:type="dxa" w:w="80"/>
+            </w:tcMar>
+          </w:tcPr>
+          <w:p>
+            <w:pPr>
+              <w:spacing w:after="0" w:line="240"/>
+              <w:jc w:val="center"/>
+            </w:pPr>
+            <w:r>
+              <w:rPr>
+                <w:b w:val="false"/>
+                <w:bCs w:val="false"/>
+                <w:sz w:val="20"/>
+                <w:szCs w:val="20"/>
+              </w:rPr>
+              <w:t xml:space="preserve">0,220–0,225</w:t>
+            </w:r>
+          </w:p>
+        </w:tc>
+        <w:tc>
+          <w:tcPr>
+            <w:tcW w:type="dxa" w:w="1996"/>
+            <w:shd w:fill="FFF2CC" w:val="clear"/>
+            <w:tcMar>
+              <w:top w:type="dxa" w:w="60"/>
+              <w:left w:type="dxa" w:w="80"/>
+              <w:bottom w:type="dxa" w:w="60"/>
+              <w:right w:type="dxa" w:w="80"/>
+            </w:tcMar>
+          </w:tcPr>
+          <w:p>
+            <w:pPr>
+              <w:spacing w:after="0" w:line="240"/>
+              <w:jc w:val="center"/>
+            </w:pPr>
+            <w:r>
+              <w:rPr>
+                <w:b w:val="false"/>
+                <w:bCs w:val="false"/>
+                <w:sz w:val="20"/>
+                <w:szCs w:val="20"/>
+              </w:rPr>
+              <w:t xml:space="preserve">0,196</w:t>
+            </w:r>
+          </w:p>
+        </w:tc>
+        <w:tc>
+          <w:tcPr>
+            <w:tcW w:type="dxa" w:w="1996"/>
+            <w:shd w:fill="FFF2CC" w:val="clear"/>
+            <w:tcMar>
+              <w:top w:type="dxa" w:w="60"/>
+              <w:left w:type="dxa" w:w="80"/>
+              <w:bottom w:type="dxa" w:w="60"/>
+              <w:right w:type="dxa" w:w="80"/>
+            </w:tcMar>
+          </w:tcPr>
+          <w:p>
+            <w:pPr>
+              <w:spacing w:after="0" w:line="240"/>
+              <w:jc w:val="center"/>
+            </w:pPr>
+            <w:r>
+              <w:rPr>
+                <w:b w:val="false"/>
+                <w:bCs w:val="false"/>
+                <w:sz w:val="20"/>
+                <w:szCs w:val="20"/>
+              </w:rPr>
+              <w:t xml:space="preserve">0,192</w:t>
+            </w:r>
+          </w:p>
+        </w:tc>
+      </w:tr>
+    </w:tbl>
+    <w:p>
+      <w:pPr>
+        <w:spacing w:after="200" w:before="80" w:line="240"/>
+        <w:jc w:val="center"/>
+      </w:pPr>
+      <w:r>
+        <w:rPr>
+          <w:i/>
+          <w:iCs/>
+          <w:sz w:val="20"/>
+          <w:szCs w:val="20"/>
+        </w:rPr>
+        <w:t xml:space="preserve">Tabela 16. Ocena porównawcza konfiguracji według kryteriów bezpieczeństwa</w:t>
+      </w:r>
+    </w:p>
+    <w:p>
+      <w:pPr>
+        <w:spacing w:after="60" w:before="0" w:line="360"/>
         <w:jc w:val="both"/>
       </w:pPr>
       <w:r>
         <w:rPr>
-          <w:sz w:val="24"/>
-          <w:szCs w:val="24"/>
+          <w:i/>
+          <w:iCs/>
+          <w:sz w:val="20"/>
+          <w:szCs w:val="20"/>
         </w:rPr>
-        <w:t xml:space="preserve">Bez ograniczenia mocy instalacji fotowoltaicznej optymalizator wskazuje konfigurację wymagającą powierzchni dachu pięciokrotnie większej od dostępnej. Wprowadzenie zbioru dopuszczalnych mocy na podstawie analizy rozmieszczenia modułów jest warunkiem koniecznym.</w:t>
+        <w:t xml:space="preserve">* Wyłącznie w wariancie wyposażonym w agregat prądotwórczy. Konfiguracja K1 bez agregatu generuje 8 762 kWh energii niedostarczonej.</w:t>
+      </w:r>
+    </w:p>
+    <w:p>
+      <w:pPr>
+        <w:spacing w:after="60" w:before="0" w:line="360"/>
+        <w:jc w:val="both"/>
+      </w:pPr>
+      <w:r>
+        <w:rPr>
+          <w:i/>
+          <w:iCs/>
+          <w:sz w:val="20"/>
+          <w:szCs w:val="20"/>
+        </w:rPr>
+        <w:t xml:space="preserve">** Przy typowej pojemności zbiornika przyagregatowego 1 000–1 500 l i zużyciu 33,7 l/h. Pokrycie pełnej awarii 72-godzinnej wymaga uzupełnienia paliwa w trakcie trwania zdarzenia.</w:t>
+      </w:r>
+    </w:p>
+    <w:p>
+      <w:pPr>
+        <w:spacing w:after="180" w:before="0" w:line="360"/>
+        <w:jc w:val="both"/>
+      </w:pPr>
+      <w:r>
+        <w:rPr>
+          <w:i/>
+          <w:iCs/>
+          <w:sz w:val="20"/>
+          <w:szCs w:val="20"/>
+        </w:rPr>
+        <w:t xml:space="preserve">*** Pod warunkiem zachowania ciągłości dostaw gazu siecią dystrybucyjną.</w:t>
       </w:r>
     </w:p>
     <w:p>
@@ -8495,7 +10039,7 @@
           <w:sz w:val="28"/>
           <w:szCs w:val="28"/>
         </w:rPr>
-        <w:t xml:space="preserve">8.3. Dobór jednostki kogeneracyjnej determinuje sens konfiguracji K3</w:t>
+        <w:t xml:space="preserve">8.3. Konfiguracja rekomendowana</w:t>
       </w:r>
     </w:p>
     <w:p>
@@ -8509,7 +10053,77 @@
           <w:sz w:val="24"/>
           <w:szCs w:val="24"/>
         </w:rPr>
-        <w:t xml:space="preserve">Generyczny agregat wysokoprężny nie jest dysponowany przez optymalizator w żadnym z analizowanych wariantów. Zastosowanie rzeczywistej jednostki gazowej z katalogu producenta zmienia wynik jakościowo — kogeneracja pracuje przez 81% roku i pokrywa 64,6% zapotrzebowania elektrycznego obiektu.</w:t>
+        <w:t xml:space="preserve">Na podstawie przeprowadzonej analizy jako rozwiązanie najkorzystniejsze pod względem bezpieczeństwa energetycznego wskazuje się konfigurację K3 — zaawansowaną mikrosieć z kogeneracją gazową.</w:t>
+      </w:r>
+    </w:p>
+    <w:p>
+      <w:pPr>
+        <w:spacing w:after="120" w:before="0" w:line="360"/>
+        <w:ind w:firstLine="566"/>
+        <w:jc w:val="both"/>
+      </w:pPr>
+      <w:r>
+        <w:rPr>
+          <w:sz w:val="24"/>
+          <w:szCs w:val="24"/>
+        </w:rPr>
+        <w:t xml:space="preserve">Przemawiają za nią cztery argumenty o charakterze rozstrzygającym.</w:t>
+      </w:r>
+    </w:p>
+    <w:p>
+      <w:pPr>
+        <w:spacing w:after="120" w:before="0" w:line="360"/>
+        <w:ind w:firstLine="566"/>
+        <w:jc w:val="both"/>
+      </w:pPr>
+      <w:r>
+        <w:rPr>
+          <w:sz w:val="24"/>
+          <w:szCs w:val="24"/>
+        </w:rPr>
+        <w:t xml:space="preserve">Po pierwsze, redukcja energii niedostarczonej o 88% względem układu pozbawionego rezerwy, przy jednoczesnym zachowaniu tej zdolności w obu badanych typach awarii — zarówno długotrwałej, jak i serii przerw krótkotrwałych.</w:t>
+      </w:r>
+    </w:p>
+    <w:p>
+      <w:pPr>
+        <w:spacing w:after="120" w:before="0" w:line="360"/>
+        <w:ind w:firstLine="566"/>
+        <w:jc w:val="both"/>
+      </w:pPr>
+      <w:r>
+        <w:rPr>
+          <w:sz w:val="24"/>
+          <w:szCs w:val="24"/>
+        </w:rPr>
+        <w:t xml:space="preserve">Po drugie, niezależność od transportu drogowego paliwa. Jest to cecha odróżniająca kogenerację gazową od agregatu wysokoprężnego w sposób jakościowy: w scenariuszu black-sky, w którym infrastruktura transportowa ulega dezorganizacji, agregat zachowuje zdolność wytwórczą wyłącznie do wyczerpania zapasu w zbiorniku, oszacowanego na 30–45 godzin wobec wymaganych 72.</w:t>
+      </w:r>
+    </w:p>
+    <w:p>
+      <w:pPr>
+        <w:spacing w:after="120" w:before="0" w:line="360"/>
+        <w:ind w:firstLine="566"/>
+        <w:jc w:val="both"/>
+      </w:pPr>
+      <w:r>
+        <w:rPr>
+          <w:sz w:val="24"/>
+          <w:szCs w:val="24"/>
+        </w:rPr>
+        <w:t xml:space="preserve">Po trzecie, praca ciągła przez 81% roku. Jednostka kogeneracyjna nie jest urządzeniem oczekującym w stanie spoczynku, lecz elementem czynnym, którego sprawność jest weryfikowana w sposób ciągły. Eliminuje to ryzyko niepowodzenia rozruchu w sytuacji awaryjnej — zjawisko stanowiące istotną przyczynę zawodności klasycznych układów rezerwowych.</w:t>
+      </w:r>
+    </w:p>
+    <w:p>
+      <w:pPr>
+        <w:spacing w:after="120" w:before="0" w:line="360"/>
+        <w:ind w:firstLine="566"/>
+        <w:jc w:val="both"/>
+      </w:pPr>
+      <w:r>
+        <w:rPr>
+          <w:sz w:val="24"/>
+          <w:szCs w:val="24"/>
+        </w:rPr>
+        <w:t xml:space="preserve">Po czwarte, najniższy spośród analizowanych wariantów uśredniony koszt energii elektrycznej wynoszący 0,192 $/kWh. Zwiększenie bezpieczeństwa nie odbywa się zatem kosztem pogorszenia wskaźników ekonomicznych.</w:t>
       </w:r>
     </w:p>
     <w:p>
@@ -8524,7 +10138,7 @@
           <w:sz w:val="28"/>
           <w:szCs w:val="28"/>
         </w:rPr>
-        <w:t xml:space="preserve">8.4. Sezonowość zasobu słonecznego wyklucza autonomię opartą na PV</w:t>
+        <w:t xml:space="preserve">8.4. Konfiguracja docelowa — uzupełnienie o rezerwę awaryjną</w:t>
       </w:r>
     </w:p>
     <w:p>
@@ -8538,7 +10152,605 @@
           <w:sz w:val="24"/>
           <w:szCs w:val="24"/>
         </w:rPr>
-        <w:t xml:space="preserve">Stosunek napromieniowania majowego do grudniowego wynoszący 8,6 : 1 oznacza, że w warunkach polskich instalacja fotowoltaiczna nie może stanowić podstawy zasilania awaryjnego w okresie zimowym. Uzasadnia to obecność źródła sterowalnego w architekturze mikrosieci.</w:t>
+        <w:t xml:space="preserve">Analiza wykazała jednocześnie, że żadna z badanych konfiguracji nie zapewnia pełnego pokrycia obciążenia we wszystkich rozpatrywanych scenariuszach. Konfiguracja K3 pozostawia 1 046 kWh energii niedostarczonej, co dla obiektu szpitalnego pozostaje wartością niedopuszczalną.</w:t>
+      </w:r>
+    </w:p>
+    <w:p>
+      <w:pPr>
+        <w:spacing w:after="120" w:before="0" w:line="360"/>
+        <w:ind w:firstLine="566"/>
+        <w:jc w:val="both"/>
+      </w:pPr>
+      <w:r>
+        <w:rPr>
+          <w:sz w:val="24"/>
+          <w:szCs w:val="24"/>
+        </w:rPr>
+        <w:t xml:space="preserve">Jako rozwiązanie docelowe proponuje się zatem architekturę hierarchiczną, łączącą zalety analizowanych wariantów:</w:t>
+      </w:r>
+    </w:p>
+    <w:tbl>
+      <w:tblPr>
+        <w:tblW w:type="dxa" w:w="9073"/>
+        <w:tblBorders>
+          <w:top w:val="single" w:color="auto" w:sz="4"/>
+          <w:left w:val="single" w:color="auto" w:sz="4"/>
+          <w:bottom w:val="single" w:color="auto" w:sz="4"/>
+          <w:right w:val="single" w:color="auto" w:sz="4"/>
+          <w:insideH w:val="single" w:color="auto" w:sz="4"/>
+          <w:insideV w:val="single" w:color="auto" w:sz="4"/>
+        </w:tblBorders>
+      </w:tblPr>
+      <w:tblGrid>
+        <w:gridCol w:w="907"/>
+        <w:gridCol w:w="2359"/>
+        <w:gridCol w:w="4174"/>
+        <w:gridCol w:w="1633"/>
+      </w:tblGrid>
+      <w:tr>
+        <w:trPr>
+          <w:tblHeader/>
+        </w:trPr>
+        <w:tc>
+          <w:tcPr>
+            <w:tcW w:type="dxa" w:w="907"/>
+            <w:shd w:fill="D9E2F3" w:val="clear"/>
+            <w:tcMar>
+              <w:top w:type="dxa" w:w="60"/>
+              <w:left w:type="dxa" w:w="80"/>
+              <w:bottom w:type="dxa" w:w="60"/>
+              <w:right w:type="dxa" w:w="80"/>
+            </w:tcMar>
+          </w:tcPr>
+          <w:p>
+            <w:pPr>
+              <w:spacing w:after="0" w:line="240"/>
+              <w:jc w:val="left"/>
+            </w:pPr>
+            <w:r>
+              <w:rPr>
+                <w:b/>
+                <w:bCs/>
+                <w:sz w:val="20"/>
+                <w:szCs w:val="20"/>
+              </w:rPr>
+              <w:t xml:space="preserve">Poziom</w:t>
+            </w:r>
+          </w:p>
+        </w:tc>
+        <w:tc>
+          <w:tcPr>
+            <w:tcW w:type="dxa" w:w="2359"/>
+            <w:shd w:fill="D9E2F3" w:val="clear"/>
+            <w:tcMar>
+              <w:top w:type="dxa" w:w="60"/>
+              <w:left w:type="dxa" w:w="80"/>
+              <w:bottom w:type="dxa" w:w="60"/>
+              <w:right w:type="dxa" w:w="80"/>
+            </w:tcMar>
+          </w:tcPr>
+          <w:p>
+            <w:pPr>
+              <w:spacing w:after="0" w:line="240"/>
+              <w:jc w:val="center"/>
+            </w:pPr>
+            <w:r>
+              <w:rPr>
+                <w:b/>
+                <w:bCs/>
+                <w:sz w:val="20"/>
+                <w:szCs w:val="20"/>
+              </w:rPr>
+              <w:t xml:space="preserve">Źródło</w:t>
+            </w:r>
+          </w:p>
+        </w:tc>
+        <w:tc>
+          <w:tcPr>
+            <w:tcW w:type="dxa" w:w="4174"/>
+            <w:shd w:fill="D9E2F3" w:val="clear"/>
+            <w:tcMar>
+              <w:top w:type="dxa" w:w="60"/>
+              <w:left w:type="dxa" w:w="80"/>
+              <w:bottom w:type="dxa" w:w="60"/>
+              <w:right w:type="dxa" w:w="80"/>
+            </w:tcMar>
+          </w:tcPr>
+          <w:p>
+            <w:pPr>
+              <w:spacing w:after="0" w:line="240"/>
+              <w:jc w:val="center"/>
+            </w:pPr>
+            <w:r>
+              <w:rPr>
+                <w:b/>
+                <w:bCs/>
+                <w:sz w:val="20"/>
+                <w:szCs w:val="20"/>
+              </w:rPr>
+              <w:t xml:space="preserve">Funkcja</w:t>
+            </w:r>
+          </w:p>
+        </w:tc>
+        <w:tc>
+          <w:tcPr>
+            <w:tcW w:type="dxa" w:w="1633"/>
+            <w:shd w:fill="D9E2F3" w:val="clear"/>
+            <w:tcMar>
+              <w:top w:type="dxa" w:w="60"/>
+              <w:left w:type="dxa" w:w="80"/>
+              <w:bottom w:type="dxa" w:w="60"/>
+              <w:right w:type="dxa" w:w="80"/>
+            </w:tcMar>
+          </w:tcPr>
+          <w:p>
+            <w:pPr>
+              <w:spacing w:after="0" w:line="240"/>
+              <w:jc w:val="center"/>
+            </w:pPr>
+            <w:r>
+              <w:rPr>
+                <w:b/>
+                <w:bCs/>
+                <w:sz w:val="20"/>
+                <w:szCs w:val="20"/>
+              </w:rPr>
+              <w:t xml:space="preserve">Czas reakcji</w:t>
+            </w:r>
+          </w:p>
+        </w:tc>
+      </w:tr>
+      <w:tr>
+        <w:trPr>
+          <w:tblHeader w:val="false"/>
+        </w:trPr>
+        <w:tc>
+          <w:tcPr>
+            <w:tcW w:type="dxa" w:w="907"/>
+            <w:tcMar>
+              <w:top w:type="dxa" w:w="60"/>
+              <w:left w:type="dxa" w:w="80"/>
+              <w:bottom w:type="dxa" w:w="60"/>
+              <w:right w:type="dxa" w:w="80"/>
+            </w:tcMar>
+          </w:tcPr>
+          <w:p>
+            <w:pPr>
+              <w:spacing w:after="0" w:line="240"/>
+              <w:jc w:val="left"/>
+            </w:pPr>
+            <w:r>
+              <w:rPr>
+                <w:sz w:val="20"/>
+                <w:szCs w:val="20"/>
+              </w:rPr>
+              <w:t xml:space="preserve">I</w:t>
+            </w:r>
+          </w:p>
+        </w:tc>
+        <w:tc>
+          <w:tcPr>
+            <w:tcW w:type="dxa" w:w="2359"/>
+            <w:tcMar>
+              <w:top w:type="dxa" w:w="60"/>
+              <w:left w:type="dxa" w:w="80"/>
+              <w:bottom w:type="dxa" w:w="60"/>
+              <w:right w:type="dxa" w:w="80"/>
+            </w:tcMar>
+          </w:tcPr>
+          <w:p>
+            <w:pPr>
+              <w:spacing w:after="0" w:line="240"/>
+              <w:jc w:val="center"/>
+            </w:pPr>
+            <w:r>
+              <w:rPr>
+                <w:sz w:val="20"/>
+                <w:szCs w:val="20"/>
+              </w:rPr>
+              <w:t xml:space="preserve">BESS (magazyn bateryjny)</w:t>
+            </w:r>
+          </w:p>
+        </w:tc>
+        <w:tc>
+          <w:tcPr>
+            <w:tcW w:type="dxa" w:w="4174"/>
+            <w:tcMar>
+              <w:top w:type="dxa" w:w="60"/>
+              <w:left w:type="dxa" w:w="80"/>
+              <w:bottom w:type="dxa" w:w="60"/>
+              <w:right w:type="dxa" w:w="80"/>
+            </w:tcMar>
+          </w:tcPr>
+          <w:p>
+            <w:pPr>
+              <w:spacing w:after="0" w:line="240"/>
+              <w:jc w:val="center"/>
+            </w:pPr>
+            <w:r>
+              <w:rPr>
+                <w:sz w:val="20"/>
+                <w:szCs w:val="20"/>
+              </w:rPr>
+              <w:t xml:space="preserve">Podtrzymanie odbiorów klasy 0,5 s, praca w trybie grid-forming</w:t>
+            </w:r>
+          </w:p>
+        </w:tc>
+        <w:tc>
+          <w:tcPr>
+            <w:tcW w:type="dxa" w:w="1633"/>
+            <w:tcMar>
+              <w:top w:type="dxa" w:w="60"/>
+              <w:left w:type="dxa" w:w="80"/>
+              <w:bottom w:type="dxa" w:w="60"/>
+              <w:right w:type="dxa" w:w="80"/>
+            </w:tcMar>
+          </w:tcPr>
+          <w:p>
+            <w:pPr>
+              <w:spacing w:after="0" w:line="240"/>
+              <w:jc w:val="center"/>
+            </w:pPr>
+            <w:r>
+              <w:rPr>
+                <w:sz w:val="20"/>
+                <w:szCs w:val="20"/>
+              </w:rPr>
+              <w:t xml:space="preserve">milisekundy</w:t>
+            </w:r>
+          </w:p>
+        </w:tc>
+      </w:tr>
+      <w:tr>
+        <w:trPr>
+          <w:tblHeader w:val="false"/>
+        </w:trPr>
+        <w:tc>
+          <w:tcPr>
+            <w:tcW w:type="dxa" w:w="907"/>
+            <w:tcMar>
+              <w:top w:type="dxa" w:w="60"/>
+              <w:left w:type="dxa" w:w="80"/>
+              <w:bottom w:type="dxa" w:w="60"/>
+              <w:right w:type="dxa" w:w="80"/>
+            </w:tcMar>
+          </w:tcPr>
+          <w:p>
+            <w:pPr>
+              <w:spacing w:after="0" w:line="240"/>
+              <w:jc w:val="left"/>
+            </w:pPr>
+            <w:r>
+              <w:rPr>
+                <w:sz w:val="20"/>
+                <w:szCs w:val="20"/>
+              </w:rPr>
+              <w:t xml:space="preserve">II</w:t>
+            </w:r>
+          </w:p>
+        </w:tc>
+        <w:tc>
+          <w:tcPr>
+            <w:tcW w:type="dxa" w:w="2359"/>
+            <w:tcMar>
+              <w:top w:type="dxa" w:w="60"/>
+              <w:left w:type="dxa" w:w="80"/>
+              <w:bottom w:type="dxa" w:w="60"/>
+              <w:right w:type="dxa" w:w="80"/>
+            </w:tcMar>
+          </w:tcPr>
+          <w:p>
+            <w:pPr>
+              <w:spacing w:after="0" w:line="240"/>
+              <w:jc w:val="center"/>
+            </w:pPr>
+            <w:r>
+              <w:rPr>
+                <w:sz w:val="20"/>
+                <w:szCs w:val="20"/>
+              </w:rPr>
+              <w:t xml:space="preserve">Kogeneracja gazowa CHP</w:t>
+            </w:r>
+          </w:p>
+        </w:tc>
+        <w:tc>
+          <w:tcPr>
+            <w:tcW w:type="dxa" w:w="4174"/>
+            <w:tcMar>
+              <w:top w:type="dxa" w:w="60"/>
+              <w:left w:type="dxa" w:w="80"/>
+              <w:bottom w:type="dxa" w:w="60"/>
+              <w:right w:type="dxa" w:w="80"/>
+            </w:tcMar>
+          </w:tcPr>
+          <w:p>
+            <w:pPr>
+              <w:spacing w:after="0" w:line="240"/>
+              <w:jc w:val="center"/>
+            </w:pPr>
+            <w:r>
+              <w:rPr>
+                <w:sz w:val="20"/>
+                <w:szCs w:val="20"/>
+              </w:rPr>
+              <w:t xml:space="preserve">Podstawowe źródło autonomii, pokrycie obciążenia bazowego</w:t>
+            </w:r>
+          </w:p>
+        </w:tc>
+        <w:tc>
+          <w:tcPr>
+            <w:tcW w:type="dxa" w:w="1633"/>
+            <w:tcMar>
+              <w:top w:type="dxa" w:w="60"/>
+              <w:left w:type="dxa" w:w="80"/>
+              <w:bottom w:type="dxa" w:w="60"/>
+              <w:right w:type="dxa" w:w="80"/>
+            </w:tcMar>
+          </w:tcPr>
+          <w:p>
+            <w:pPr>
+              <w:spacing w:after="0" w:line="240"/>
+              <w:jc w:val="center"/>
+            </w:pPr>
+            <w:r>
+              <w:rPr>
+                <w:sz w:val="20"/>
+                <w:szCs w:val="20"/>
+              </w:rPr>
+              <w:t xml:space="preserve">minuty</w:t>
+            </w:r>
+          </w:p>
+        </w:tc>
+      </w:tr>
+      <w:tr>
+        <w:trPr>
+          <w:tblHeader w:val="false"/>
+        </w:trPr>
+        <w:tc>
+          <w:tcPr>
+            <w:tcW w:type="dxa" w:w="907"/>
+            <w:tcMar>
+              <w:top w:type="dxa" w:w="60"/>
+              <w:left w:type="dxa" w:w="80"/>
+              <w:bottom w:type="dxa" w:w="60"/>
+              <w:right w:type="dxa" w:w="80"/>
+            </w:tcMar>
+          </w:tcPr>
+          <w:p>
+            <w:pPr>
+              <w:spacing w:after="0" w:line="240"/>
+              <w:jc w:val="left"/>
+            </w:pPr>
+            <w:r>
+              <w:rPr>
+                <w:sz w:val="20"/>
+                <w:szCs w:val="20"/>
+              </w:rPr>
+              <w:t xml:space="preserve">III</w:t>
+            </w:r>
+          </w:p>
+        </w:tc>
+        <w:tc>
+          <w:tcPr>
+            <w:tcW w:type="dxa" w:w="2359"/>
+            <w:tcMar>
+              <w:top w:type="dxa" w:w="60"/>
+              <w:left w:type="dxa" w:w="80"/>
+              <w:bottom w:type="dxa" w:w="60"/>
+              <w:right w:type="dxa" w:w="80"/>
+            </w:tcMar>
+          </w:tcPr>
+          <w:p>
+            <w:pPr>
+              <w:spacing w:after="0" w:line="240"/>
+              <w:jc w:val="center"/>
+            </w:pPr>
+            <w:r>
+              <w:rPr>
+                <w:sz w:val="20"/>
+                <w:szCs w:val="20"/>
+              </w:rPr>
+              <w:t xml:space="preserve">Instalacja PV</w:t>
+            </w:r>
+          </w:p>
+        </w:tc>
+        <w:tc>
+          <w:tcPr>
+            <w:tcW w:type="dxa" w:w="4174"/>
+            <w:tcMar>
+              <w:top w:type="dxa" w:w="60"/>
+              <w:left w:type="dxa" w:w="80"/>
+              <w:bottom w:type="dxa" w:w="60"/>
+              <w:right w:type="dxa" w:w="80"/>
+            </w:tcMar>
+          </w:tcPr>
+          <w:p>
+            <w:pPr>
+              <w:spacing w:after="0" w:line="240"/>
+              <w:jc w:val="center"/>
+            </w:pPr>
+            <w:r>
+              <w:rPr>
+                <w:sz w:val="20"/>
+                <w:szCs w:val="20"/>
+              </w:rPr>
+              <w:t xml:space="preserve">Wsparcie sezonowe, redukcja poboru z sieci</w:t>
+            </w:r>
+          </w:p>
+        </w:tc>
+        <w:tc>
+          <w:tcPr>
+            <w:tcW w:type="dxa" w:w="1633"/>
+            <w:tcMar>
+              <w:top w:type="dxa" w:w="60"/>
+              <w:left w:type="dxa" w:w="80"/>
+              <w:bottom w:type="dxa" w:w="60"/>
+              <w:right w:type="dxa" w:w="80"/>
+            </w:tcMar>
+          </w:tcPr>
+          <w:p>
+            <w:pPr>
+              <w:spacing w:after="0" w:line="240"/>
+              <w:jc w:val="center"/>
+            </w:pPr>
+            <w:r>
+              <w:rPr>
+                <w:sz w:val="20"/>
+                <w:szCs w:val="20"/>
+              </w:rPr>
+              <w:t xml:space="preserve">—</w:t>
+            </w:r>
+          </w:p>
+        </w:tc>
+      </w:tr>
+      <w:tr>
+        <w:trPr>
+          <w:tblHeader w:val="false"/>
+        </w:trPr>
+        <w:tc>
+          <w:tcPr>
+            <w:tcW w:type="dxa" w:w="907"/>
+            <w:tcMar>
+              <w:top w:type="dxa" w:w="60"/>
+              <w:left w:type="dxa" w:w="80"/>
+              <w:bottom w:type="dxa" w:w="60"/>
+              <w:right w:type="dxa" w:w="80"/>
+            </w:tcMar>
+          </w:tcPr>
+          <w:p>
+            <w:pPr>
+              <w:spacing w:after="0" w:line="240"/>
+              <w:jc w:val="left"/>
+            </w:pPr>
+            <w:r>
+              <w:rPr>
+                <w:sz w:val="20"/>
+                <w:szCs w:val="20"/>
+              </w:rPr>
+              <w:t xml:space="preserve">IV</w:t>
+            </w:r>
+          </w:p>
+        </w:tc>
+        <w:tc>
+          <w:tcPr>
+            <w:tcW w:type="dxa" w:w="2359"/>
+            <w:tcMar>
+              <w:top w:type="dxa" w:w="60"/>
+              <w:left w:type="dxa" w:w="80"/>
+              <w:bottom w:type="dxa" w:w="60"/>
+              <w:right w:type="dxa" w:w="80"/>
+            </w:tcMar>
+          </w:tcPr>
+          <w:p>
+            <w:pPr>
+              <w:spacing w:after="0" w:line="240"/>
+              <w:jc w:val="center"/>
+            </w:pPr>
+            <w:r>
+              <w:rPr>
+                <w:sz w:val="20"/>
+                <w:szCs w:val="20"/>
+              </w:rPr>
+              <w:t xml:space="preserve">Agregat prądotwórczy</w:t>
+            </w:r>
+          </w:p>
+        </w:tc>
+        <w:tc>
+          <w:tcPr>
+            <w:tcW w:type="dxa" w:w="4174"/>
+            <w:tcMar>
+              <w:top w:type="dxa" w:w="60"/>
+              <w:left w:type="dxa" w:w="80"/>
+              <w:bottom w:type="dxa" w:w="60"/>
+              <w:right w:type="dxa" w:w="80"/>
+            </w:tcMar>
+          </w:tcPr>
+          <w:p>
+            <w:pPr>
+              <w:spacing w:after="0" w:line="240"/>
+              <w:jc w:val="center"/>
+            </w:pPr>
+            <w:r>
+              <w:rPr>
+                <w:sz w:val="20"/>
+                <w:szCs w:val="20"/>
+              </w:rPr>
+              <w:t xml:space="preserve">Rezerwa ostatniej instancji przy jednoczesnej awarii sieci gazowej</w:t>
+            </w:r>
+          </w:p>
+        </w:tc>
+        <w:tc>
+          <w:tcPr>
+            <w:tcW w:type="dxa" w:w="1633"/>
+            <w:tcMar>
+              <w:top w:type="dxa" w:w="60"/>
+              <w:left w:type="dxa" w:w="80"/>
+              <w:bottom w:type="dxa" w:w="60"/>
+              <w:right w:type="dxa" w:w="80"/>
+            </w:tcMar>
+          </w:tcPr>
+          <w:p>
+            <w:pPr>
+              <w:spacing w:after="0" w:line="240"/>
+              <w:jc w:val="center"/>
+            </w:pPr>
+            <w:r>
+              <w:rPr>
+                <w:sz w:val="20"/>
+                <w:szCs w:val="20"/>
+              </w:rPr>
+              <w:t xml:space="preserve">15 s</w:t>
+            </w:r>
+          </w:p>
+        </w:tc>
+      </w:tr>
+    </w:tbl>
+    <w:p>
+      <w:pPr>
+        <w:spacing w:after="200" w:before="80" w:line="240"/>
+        <w:jc w:val="center"/>
+      </w:pPr>
+      <w:r>
+        <w:rPr>
+          <w:i/>
+          <w:iCs/>
+          <w:sz w:val="20"/>
+          <w:szCs w:val="20"/>
+        </w:rPr>
+        <w:t xml:space="preserve">Tabela 17. Proponowana architektura hierarchiczna systemu zasilania</w:t>
+      </w:r>
+    </w:p>
+    <w:p>
+      <w:pPr>
+        <w:spacing w:after="120" w:before="0" w:line="360"/>
+        <w:ind w:firstLine="566"/>
+        <w:jc w:val="both"/>
+      </w:pPr>
+      <w:r>
+        <w:rPr>
+          <w:sz w:val="24"/>
+          <w:szCs w:val="24"/>
+        </w:rPr>
+        <w:t xml:space="preserve">W układzie takim agregat wysokoprężny zachowuje rolę rezerwy ostatniej instancji, uruchamianej wyłącznie w przypadku jednoczesnej niedostępności sieci elektroenergetycznej i gazowej. Jego moc może przy tym zostać ograniczona do ustawowego minimum 30% mocy szczytowej, ponieważ obciążenie bazowe przejmuje jednostka kogeneracyjna. Pozwala to na obniżenie nakładów inwestycyjnych względem układu klasycznego, w którym agregat wymiarowany jest na pełne obciążenie obiektu.</w:t>
+      </w:r>
+    </w:p>
+    <w:p>
+      <w:pPr>
+        <w:spacing w:after="120" w:before="0" w:line="360"/>
+        <w:ind w:firstLine="566"/>
+        <w:jc w:val="both"/>
+      </w:pPr>
+      <w:r>
+        <w:rPr>
+          <w:sz w:val="24"/>
+          <w:szCs w:val="24"/>
+        </w:rPr>
+        <w:t xml:space="preserve">Weryfikacja ilościowa proponowanej architektury stanowi przedmiot obliczeń właściwych, po wyborze rzeczywistego obiektu referencyjnego.</w:t>
+      </w:r>
+    </w:p>
+    <w:p>
+      <w:r>
+        <w:br w:type="page"/>
       </w:r>
     </w:p>
     <w:p>
@@ -8553,7 +10765,152 @@
           <w:sz w:val="28"/>
           <w:szCs w:val="28"/>
         </w:rPr>
-        <w:t xml:space="preserve">9. Zadania przed obliczeniami właściwymi</w:t>
+        <w:t xml:space="preserve">9. Wnioski metodyczne</w:t>
+      </w:r>
+    </w:p>
+    <w:p>
+      <w:pPr>
+        <w:pStyle w:val="Heading2"/>
+        <w:spacing w:after="180" w:before="240" w:line="360"/>
+      </w:pPr>
+      <w:r>
+        <w:rPr>
+          <w:b/>
+          <w:bCs/>
+          <w:sz w:val="28"/>
+          <w:szCs w:val="28"/>
+        </w:rPr>
+        <w:t xml:space="preserve">9.1. Kryterium najniższego NPC prowadzi do rozwiązania niedopuszczalnego</w:t>
+      </w:r>
+    </w:p>
+    <w:p>
+      <w:pPr>
+        <w:spacing w:after="120" w:before="0" w:line="360"/>
+        <w:ind w:firstLine="566"/>
+        <w:jc w:val="both"/>
+      </w:pPr>
+      <w:r>
+        <w:rPr>
+          <w:sz w:val="24"/>
+          <w:szCs w:val="24"/>
+        </w:rPr>
+        <w:t xml:space="preserve">We wszystkich wariantach awaryjnych konfiguracją o najniższym koszcie bieżącym netto pozostaje układ pozbawiony źródła rezerwowego — ten sam, który generuje kilka tysięcy kilowatogodzin energii niedostarczonej. Optymalizator uznaje niedostarczenie energii do szpitala za rozwiązanie tańsze niż zakup źródła rezerwowego. Koszt zapewnienia pełnego pokrycia wynosi około 220 000 $ w kategoriach NPC, co odpowiada wzrostowi LCOE o 16%.</w:t>
+      </w:r>
+    </w:p>
+    <w:p>
+      <w:pPr>
+        <w:spacing w:after="120" w:before="0" w:line="360"/>
+        <w:ind w:firstLine="566"/>
+        <w:jc w:val="both"/>
+      </w:pPr>
+      <w:r>
+        <w:rPr>
+          <w:sz w:val="24"/>
+          <w:szCs w:val="24"/>
+        </w:rPr>
+        <w:t xml:space="preserve">Konsekwencją dla dalszego toku pracy jest konieczność traktowania energii niedostarczonej jako ograniczenia twardego, nie zaś jako składnika funkcji celu.</w:t>
+      </w:r>
+    </w:p>
+    <w:p>
+      <w:pPr>
+        <w:pStyle w:val="Heading2"/>
+        <w:spacing w:after="180" w:before="240" w:line="360"/>
+      </w:pPr>
+      <w:r>
+        <w:rPr>
+          <w:b/>
+          <w:bCs/>
+          <w:sz w:val="28"/>
+          <w:szCs w:val="28"/>
+        </w:rPr>
+        <w:t xml:space="preserve">9.2. Ograniczenie przestrzenne warunkiem wiarygodności wyników</w:t>
+      </w:r>
+    </w:p>
+    <w:p>
+      <w:pPr>
+        <w:spacing w:after="120" w:before="0" w:line="360"/>
+        <w:ind w:firstLine="566"/>
+        <w:jc w:val="both"/>
+      </w:pPr>
+      <w:r>
+        <w:rPr>
+          <w:sz w:val="24"/>
+          <w:szCs w:val="24"/>
+        </w:rPr>
+        <w:t xml:space="preserve">Bez ograniczenia mocy instalacji fotowoltaicznej optymalizator wskazuje konfigurację wymagającą powierzchni dachu pięciokrotnie większej od dostępnej. Wprowadzenie zbioru dopuszczalnych mocy na podstawie analizy rozmieszczenia modułów jest warunkiem koniecznym.</w:t>
+      </w:r>
+    </w:p>
+    <w:p>
+      <w:pPr>
+        <w:pStyle w:val="Heading2"/>
+        <w:spacing w:after="180" w:before="240" w:line="360"/>
+      </w:pPr>
+      <w:r>
+        <w:rPr>
+          <w:b/>
+          <w:bCs/>
+          <w:sz w:val="28"/>
+          <w:szCs w:val="28"/>
+        </w:rPr>
+        <w:t xml:space="preserve">9.3. Dobór jednostki kogeneracyjnej determinuje sens konfiguracji K3</w:t>
+      </w:r>
+    </w:p>
+    <w:p>
+      <w:pPr>
+        <w:spacing w:after="120" w:before="0" w:line="360"/>
+        <w:ind w:firstLine="566"/>
+        <w:jc w:val="both"/>
+      </w:pPr>
+      <w:r>
+        <w:rPr>
+          <w:sz w:val="24"/>
+          <w:szCs w:val="24"/>
+        </w:rPr>
+        <w:t xml:space="preserve">Generyczny agregat wysokoprężny nie jest dysponowany przez optymalizator w żadnym z analizowanych wariantów. Zastosowanie rzeczywistej jednostki gazowej z katalogu producenta zmienia wynik jakościowo — kogeneracja pracuje przez 81% roku i pokrywa 64,6% zapotrzebowania elektrycznego obiektu.</w:t>
+      </w:r>
+    </w:p>
+    <w:p>
+      <w:pPr>
+        <w:pStyle w:val="Heading2"/>
+        <w:spacing w:after="180" w:before="240" w:line="360"/>
+      </w:pPr>
+      <w:r>
+        <w:rPr>
+          <w:b/>
+          <w:bCs/>
+          <w:sz w:val="28"/>
+          <w:szCs w:val="28"/>
+        </w:rPr>
+        <w:t xml:space="preserve">9.4. Sezonowość zasobu słonecznego wyklucza autonomię opartą na PV</w:t>
+      </w:r>
+    </w:p>
+    <w:p>
+      <w:pPr>
+        <w:spacing w:after="120" w:before="0" w:line="360"/>
+        <w:ind w:firstLine="566"/>
+        <w:jc w:val="both"/>
+      </w:pPr>
+      <w:r>
+        <w:rPr>
+          <w:sz w:val="24"/>
+          <w:szCs w:val="24"/>
+        </w:rPr>
+        <w:t xml:space="preserve">Stosunek napromieniowania majowego do grudniowego wynoszący 8,6 : 1 oznacza, że w warunkach polskich instalacja fotowoltaiczna nie może stanowić podstawy zasilania awaryjnego w okresie zimowym. Uzasadnia to obecność źródła sterowalnego w architekturze mikrosieci.</w:t>
+      </w:r>
+    </w:p>
+    <w:p>
+      <w:pPr>
+        <w:pStyle w:val="Heading1"/>
+        <w:spacing w:after="240" w:before="240" w:line="360"/>
+      </w:pPr>
+      <w:r>
+        <w:rPr>
+          <w:b/>
+          <w:bCs/>
+          <w:sz w:val="28"/>
+          <w:szCs w:val="28"/>
+        </w:rPr>
+        <w:t xml:space="preserve">10. Zadania przed obliczeniami właściwymi</w:t>
       </w:r>
     </w:p>
     <w:tbl>
@@ -9068,7 +11425,7 @@
           <w:sz w:val="20"/>
           <w:szCs w:val="20"/>
         </w:rPr>
-        <w:t xml:space="preserve">Tabela 15. Zadania do wykonania przed przystąpieniem do obliczeń właściwych</w:t>
+        <w:t xml:space="preserve">Tabela 18. Zadania do wykonania przed przystąpieniem do obliczeń właściwych</w:t>
       </w:r>
     </w:p>
     <w:p>

</xml_diff>